<commit_message>
SC-09 sanitize public Site File copy
</commit_message>
<xml_diff>
--- a/documents/Soul Cafe Micro Club Site File v0.7 - Public Copy.docx
+++ b/documents/Soul Cafe Micro Club Site File v0.7 - Public Copy.docx
@@ -244,7 +244,7 @@
           </w:tcPr>
           <w:p>
             <w:r>
-              <w:t>C:\Hermes\Project Indlela\03 - PARTICIPANT FRAMEWORKS\PI-CLUB-002 Soul Cafe\01 - CONSTITUTION\Soul Cafe Constitution v0.1.docx</w:t>
+              <w:t>Controlled participant record location retained privately.</w:t>
             </w:r>
           </w:p>
         </w:tc>
@@ -266,7 +266,7 @@
           </w:tcPr>
           <w:p>
             <w:r>
-              <w:t>C:\Hermes\Project Indlela</w:t>
+              <w:t>Controlled participant record location retained privately.</w:t>
             </w:r>
           </w:p>
         </w:tc>

</xml_diff>